<commit_message>
docs: sync generated docx files with latest markdown updates
</commit_message>
<xml_diff>
--- a/docs/deployment-guide.docx
+++ b/docs/deployment-guide.docx
@@ -2654,7 +2654,7 @@
                 <w:rFonts w:ascii="Segoe UI" w:hAnsi="Segoe UI"/>
                 <w:sz w:val="19"/>
               </w:rPr>
-              <w:t>Nguyễn Tấn Tài</w:t>
+              <w:t>Phạm Công Tài</w:t>
             </w:r>
           </w:p>
         </w:tc>
@@ -2858,7 +2858,7 @@
                 <w:rFonts w:ascii="Segoe UI" w:hAnsi="Segoe UI"/>
                 <w:sz w:val="19"/>
               </w:rPr>
-              <w:t>Hoàng Bảo Long</w:t>
+              <w:t>Phan Văn Hoàng Long</w:t>
             </w:r>
           </w:p>
         </w:tc>

</xml_diff>